<commit_message>
Connect Layer 3 to patient state; fix scoring bug and evidence citations
</commit_message>
<xml_diff>
--- a/docs/thesis/HepatoTwin_Experiment_Record.docx
+++ b/docs/thesis/HepatoTwin_Experiment_Record.docx
@@ -501,6 +501,68 @@
                 <w:sz w:val="20"/>
               </w:rPr>
               <w:t>Trained on 2017–2020, tested on 2021–2023 (Section A.10)</w:t>
+            </w:r>
+          </w:p>
+        </w:tc>
+      </w:tr>
+      <w:tr>
+        <w:trPr>
+          <w:cantSplit/>
+        </w:trPr>
+        <w:tc>
+          <w:tcPr>
+            <w:tcW w:type="dxa" w:w="2608"/>
+          </w:tcPr>
+          <w:p>
+            <w:pPr>
+              <w:spacing w:line="240" w:lineRule="auto" w:after="40" w:before="40"/>
+              <w:jc w:val="left"/>
+            </w:pPr>
+            <w:r>
+              <w:rPr>
+                <w:b w:val="0"/>
+                <w:i w:val="0"/>
+                <w:sz w:val="20"/>
+              </w:rPr>
+              <w:t>Against clinical scores</w:t>
+            </w:r>
+          </w:p>
+        </w:tc>
+        <w:tc>
+          <w:tcPr>
+            <w:tcW w:type="dxa" w:w="1928"/>
+          </w:tcPr>
+          <w:p>
+            <w:pPr>
+              <w:spacing w:line="240" w:lineRule="auto" w:after="40" w:before="40"/>
+              <w:jc w:val="left"/>
+            </w:pPr>
+            <w:r>
+              <w:rPr>
+                <w:b w:val="0"/>
+                <w:i w:val="0"/>
+                <w:sz w:val="20"/>
+              </w:rPr>
+              <w:t>AUC +0.018 vs FLI; +0.047 vs HSI</w:t>
+            </w:r>
+          </w:p>
+        </w:tc>
+        <w:tc>
+          <w:tcPr>
+            <w:tcW w:type="dxa" w:w="4479"/>
+          </w:tcPr>
+          <w:p>
+            <w:pPr>
+              <w:spacing w:line="240" w:lineRule="auto" w:after="40" w:before="40"/>
+              <w:jc w:val="left"/>
+            </w:pPr>
+            <w:r>
+              <w:rPr>
+                <w:b w:val="0"/>
+                <w:i w:val="0"/>
+                <w:sz w:val="20"/>
+              </w:rPr>
+              <w:t>CAP ≥ 248, same 2,703 test participants (Section A.11)</w:t>
             </w:r>
           </w:p>
         </w:tc>
@@ -10386,7 +10448,816 @@
         <w:pStyle w:val="Heading2"/>
       </w:pPr>
       <w:r>
-        <w:t>A.11 Limitations</w:t>
+        <w:t>A.11 Comparison with Clinical Scores and Figures</w:t>
+      </w:r>
+    </w:p>
+    <w:p>
+      <w:r>
+        <w:rPr>
+          <w:b w:val="0"/>
+          <w:i w:val="0"/>
+        </w:rPr>
+        <w:t>The selected classifiers were compared with two established non-invasive steatosis scores on the same held-out participants: the Fatty Liver Index (FLI; Bedogni et al., 2006), computed from BMI, waist circumference, triglycerides and GGT, and the Hepatic Steatosis Index (HSI; Lee et al., 2010), computed from the ALT/AST ratio, BMI, sex and diabetes. The comparison used the 2,703 test participants with every input to both scores. Differences in AUC are paired, with 95% intervals from 1,000 bootstrap resamples.</w:t>
+      </w:r>
+    </w:p>
+    <w:p>
+      <w:pPr>
+        <w:pStyle w:val="Caption"/>
+      </w:pPr>
+      <w:r>
+        <w:rPr>
+          <w:b/>
+        </w:rPr>
+        <w:t xml:space="preserve">Table A.14. </w:t>
+      </w:r>
+      <w:r>
+        <w:t>Discrimination of the selected classifiers and two clinical scores on the same test participants (n = 2,703). Δ AUC is the model minus the score.</w:t>
+      </w:r>
+    </w:p>
+    <w:tbl>
+      <w:tblPr>
+        <w:tblW w:type="auto" w:w="0"/>
+        <w:jc w:val="center"/>
+        <w:tblLayout w:type="fixed"/>
+        <w:tblLook w:firstColumn="1" w:firstRow="1" w:lastColumn="0" w:lastRow="0" w:noHBand="0" w:noVBand="1" w:val="04A0"/>
+        <w:tblBorders>
+          <w:top w:val="single" w:sz="12" w:space="0" w:color="000000"/>
+          <w:bottom w:val="single" w:sz="12" w:space="0" w:color="000000"/>
+        </w:tblBorders>
+        <w:tblLayout w:type="fixed"/>
+      </w:tblPr>
+      <w:tblGrid>
+        <w:gridCol w:w="1504"/>
+        <w:gridCol w:w="1504"/>
+        <w:gridCol w:w="1504"/>
+        <w:gridCol w:w="1504"/>
+        <w:gridCol w:w="1504"/>
+        <w:gridCol w:w="1504"/>
+      </w:tblGrid>
+      <w:tr>
+        <w:trPr>
+          <w:tblHeader/>
+          <w:cantSplit/>
+        </w:trPr>
+        <w:tc>
+          <w:tcPr>
+            <w:tcW w:type="dxa" w:w="1701"/>
+            <w:shd w:val="clear" w:color="auto" w:fill="EDEDED"/>
+            <w:tcBorders>
+              <w:bottom w:val="single" w:sz="6" w:space="0" w:color="000000"/>
+            </w:tcBorders>
+          </w:tcPr>
+          <w:p>
+            <w:pPr>
+              <w:spacing w:line="240" w:lineRule="auto" w:after="40" w:before="40"/>
+              <w:jc w:val="left"/>
+            </w:pPr>
+            <w:r>
+              <w:rPr>
+                <w:b/>
+                <w:i w:val="0"/>
+                <w:sz w:val="18"/>
+              </w:rPr>
+              <w:t>Target</w:t>
+            </w:r>
+          </w:p>
+        </w:tc>
+        <w:tc>
+          <w:tcPr>
+            <w:tcW w:type="dxa" w:w="1134"/>
+            <w:shd w:val="clear" w:color="auto" w:fill="EDEDED"/>
+            <w:tcBorders>
+              <w:bottom w:val="single" w:sz="6" w:space="0" w:color="000000"/>
+            </w:tcBorders>
+          </w:tcPr>
+          <w:p>
+            <w:pPr>
+              <w:spacing w:line="240" w:lineRule="auto" w:after="40" w:before="40"/>
+              <w:jc w:val="right"/>
+            </w:pPr>
+            <w:r>
+              <w:rPr>
+                <w:b/>
+                <w:i w:val="0"/>
+                <w:sz w:val="18"/>
+              </w:rPr>
+              <w:t>Model AUC</w:t>
+            </w:r>
+          </w:p>
+        </w:tc>
+        <w:tc>
+          <w:tcPr>
+            <w:tcW w:type="dxa" w:w="1020"/>
+            <w:shd w:val="clear" w:color="auto" w:fill="EDEDED"/>
+            <w:tcBorders>
+              <w:bottom w:val="single" w:sz="6" w:space="0" w:color="000000"/>
+            </w:tcBorders>
+          </w:tcPr>
+          <w:p>
+            <w:pPr>
+              <w:spacing w:line="240" w:lineRule="auto" w:after="40" w:before="40"/>
+              <w:jc w:val="right"/>
+            </w:pPr>
+            <w:r>
+              <w:rPr>
+                <w:b/>
+                <w:i w:val="0"/>
+                <w:sz w:val="18"/>
+              </w:rPr>
+              <w:t>FLI AUC</w:t>
+            </w:r>
+          </w:p>
+        </w:tc>
+        <w:tc>
+          <w:tcPr>
+            <w:tcW w:type="dxa" w:w="1814"/>
+            <w:shd w:val="clear" w:color="auto" w:fill="EDEDED"/>
+            <w:tcBorders>
+              <w:bottom w:val="single" w:sz="6" w:space="0" w:color="000000"/>
+            </w:tcBorders>
+          </w:tcPr>
+          <w:p>
+            <w:pPr>
+              <w:spacing w:line="240" w:lineRule="auto" w:after="40" w:before="40"/>
+              <w:jc w:val="right"/>
+            </w:pPr>
+            <w:r>
+              <w:rPr>
+                <w:b/>
+                <w:i w:val="0"/>
+                <w:sz w:val="18"/>
+              </w:rPr>
+              <w:t>Δ AUC vs FLI</w:t>
+            </w:r>
+          </w:p>
+        </w:tc>
+        <w:tc>
+          <w:tcPr>
+            <w:tcW w:type="dxa" w:w="1020"/>
+            <w:shd w:val="clear" w:color="auto" w:fill="EDEDED"/>
+            <w:tcBorders>
+              <w:bottom w:val="single" w:sz="6" w:space="0" w:color="000000"/>
+            </w:tcBorders>
+          </w:tcPr>
+          <w:p>
+            <w:pPr>
+              <w:spacing w:line="240" w:lineRule="auto" w:after="40" w:before="40"/>
+              <w:jc w:val="right"/>
+            </w:pPr>
+            <w:r>
+              <w:rPr>
+                <w:b/>
+                <w:i w:val="0"/>
+                <w:sz w:val="18"/>
+              </w:rPr>
+              <w:t>HSI AUC</w:t>
+            </w:r>
+          </w:p>
+        </w:tc>
+        <w:tc>
+          <w:tcPr>
+            <w:tcW w:type="dxa" w:w="1814"/>
+            <w:shd w:val="clear" w:color="auto" w:fill="EDEDED"/>
+            <w:tcBorders>
+              <w:bottom w:val="single" w:sz="6" w:space="0" w:color="000000"/>
+            </w:tcBorders>
+          </w:tcPr>
+          <w:p>
+            <w:pPr>
+              <w:spacing w:line="240" w:lineRule="auto" w:after="40" w:before="40"/>
+              <w:jc w:val="right"/>
+            </w:pPr>
+            <w:r>
+              <w:rPr>
+                <w:b/>
+                <w:i w:val="0"/>
+                <w:sz w:val="18"/>
+              </w:rPr>
+              <w:t>Δ AUC vs HSI</w:t>
+            </w:r>
+          </w:p>
+        </w:tc>
+      </w:tr>
+      <w:tr>
+        <w:trPr>
+          <w:cantSplit/>
+        </w:trPr>
+        <w:tc>
+          <w:tcPr>
+            <w:tcW w:type="dxa" w:w="1701"/>
+          </w:tcPr>
+          <w:p>
+            <w:pPr>
+              <w:spacing w:line="240" w:lineRule="auto" w:after="40" w:before="40"/>
+              <w:jc w:val="left"/>
+            </w:pPr>
+            <w:r>
+              <w:rPr>
+                <w:b w:val="0"/>
+                <w:i w:val="0"/>
+                <w:sz w:val="18"/>
+              </w:rPr>
+              <w:t>CAP ≥ 248 dB/m</w:t>
+            </w:r>
+          </w:p>
+        </w:tc>
+        <w:tc>
+          <w:tcPr>
+            <w:tcW w:type="dxa" w:w="1134"/>
+          </w:tcPr>
+          <w:p>
+            <w:pPr>
+              <w:spacing w:line="240" w:lineRule="auto" w:after="40" w:before="40"/>
+              <w:jc w:val="right"/>
+            </w:pPr>
+            <w:r>
+              <w:rPr>
+                <w:b w:val="0"/>
+                <w:i w:val="0"/>
+                <w:sz w:val="18"/>
+              </w:rPr>
+              <w:t>0.860</w:t>
+            </w:r>
+          </w:p>
+        </w:tc>
+        <w:tc>
+          <w:tcPr>
+            <w:tcW w:type="dxa" w:w="1020"/>
+          </w:tcPr>
+          <w:p>
+            <w:pPr>
+              <w:spacing w:line="240" w:lineRule="auto" w:after="40" w:before="40"/>
+              <w:jc w:val="right"/>
+            </w:pPr>
+            <w:r>
+              <w:rPr>
+                <w:b w:val="0"/>
+                <w:i w:val="0"/>
+                <w:sz w:val="18"/>
+              </w:rPr>
+              <w:t>0.842</w:t>
+            </w:r>
+          </w:p>
+        </w:tc>
+        <w:tc>
+          <w:tcPr>
+            <w:tcW w:type="dxa" w:w="1814"/>
+          </w:tcPr>
+          <w:p>
+            <w:pPr>
+              <w:spacing w:line="240" w:lineRule="auto" w:after="40" w:before="40"/>
+              <w:jc w:val="right"/>
+            </w:pPr>
+            <w:r>
+              <w:rPr>
+                <w:b w:val="0"/>
+                <w:i w:val="0"/>
+                <w:sz w:val="18"/>
+              </w:rPr>
+              <w:t>+0.018 (0.012–0.025)</w:t>
+            </w:r>
+          </w:p>
+        </w:tc>
+        <w:tc>
+          <w:tcPr>
+            <w:tcW w:type="dxa" w:w="1020"/>
+          </w:tcPr>
+          <w:p>
+            <w:pPr>
+              <w:spacing w:line="240" w:lineRule="auto" w:after="40" w:before="40"/>
+              <w:jc w:val="right"/>
+            </w:pPr>
+            <w:r>
+              <w:rPr>
+                <w:b w:val="0"/>
+                <w:i w:val="0"/>
+                <w:sz w:val="18"/>
+              </w:rPr>
+              <w:t>0.813</w:t>
+            </w:r>
+          </w:p>
+        </w:tc>
+        <w:tc>
+          <w:tcPr>
+            <w:tcW w:type="dxa" w:w="1814"/>
+          </w:tcPr>
+          <w:p>
+            <w:pPr>
+              <w:spacing w:line="240" w:lineRule="auto" w:after="40" w:before="40"/>
+              <w:jc w:val="right"/>
+            </w:pPr>
+            <w:r>
+              <w:rPr>
+                <w:b w:val="0"/>
+                <w:i w:val="0"/>
+                <w:sz w:val="18"/>
+              </w:rPr>
+              <w:t>+0.047 (0.038–0.057)</w:t>
+            </w:r>
+          </w:p>
+        </w:tc>
+      </w:tr>
+      <w:tr>
+        <w:trPr>
+          <w:cantSplit/>
+        </w:trPr>
+        <w:tc>
+          <w:tcPr>
+            <w:tcW w:type="dxa" w:w="1701"/>
+          </w:tcPr>
+          <w:p>
+            <w:pPr>
+              <w:spacing w:line="240" w:lineRule="auto" w:after="40" w:before="40"/>
+              <w:jc w:val="left"/>
+            </w:pPr>
+            <w:r>
+              <w:rPr>
+                <w:b w:val="0"/>
+                <w:i w:val="0"/>
+                <w:sz w:val="18"/>
+              </w:rPr>
+              <w:t>CAP ≥ 280 dB/m</w:t>
+            </w:r>
+          </w:p>
+        </w:tc>
+        <w:tc>
+          <w:tcPr>
+            <w:tcW w:type="dxa" w:w="1134"/>
+          </w:tcPr>
+          <w:p>
+            <w:pPr>
+              <w:spacing w:line="240" w:lineRule="auto" w:after="40" w:before="40"/>
+              <w:jc w:val="right"/>
+            </w:pPr>
+            <w:r>
+              <w:rPr>
+                <w:b w:val="0"/>
+                <w:i w:val="0"/>
+                <w:sz w:val="18"/>
+              </w:rPr>
+              <w:t>0.870</w:t>
+            </w:r>
+          </w:p>
+        </w:tc>
+        <w:tc>
+          <w:tcPr>
+            <w:tcW w:type="dxa" w:w="1020"/>
+          </w:tcPr>
+          <w:p>
+            <w:pPr>
+              <w:spacing w:line="240" w:lineRule="auto" w:after="40" w:before="40"/>
+              <w:jc w:val="right"/>
+            </w:pPr>
+            <w:r>
+              <w:rPr>
+                <w:b w:val="0"/>
+                <w:i w:val="0"/>
+                <w:sz w:val="18"/>
+              </w:rPr>
+              <w:t>0.843</w:t>
+            </w:r>
+          </w:p>
+        </w:tc>
+        <w:tc>
+          <w:tcPr>
+            <w:tcW w:type="dxa" w:w="1814"/>
+          </w:tcPr>
+          <w:p>
+            <w:pPr>
+              <w:spacing w:line="240" w:lineRule="auto" w:after="40" w:before="40"/>
+              <w:jc w:val="right"/>
+            </w:pPr>
+            <w:r>
+              <w:rPr>
+                <w:b w:val="0"/>
+                <w:i w:val="0"/>
+                <w:sz w:val="18"/>
+              </w:rPr>
+              <w:t>+0.028 (0.021–0.035)</w:t>
+            </w:r>
+          </w:p>
+        </w:tc>
+        <w:tc>
+          <w:tcPr>
+            <w:tcW w:type="dxa" w:w="1020"/>
+          </w:tcPr>
+          <w:p>
+            <w:pPr>
+              <w:spacing w:line="240" w:lineRule="auto" w:after="40" w:before="40"/>
+              <w:jc w:val="right"/>
+            </w:pPr>
+            <w:r>
+              <w:rPr>
+                <w:b w:val="0"/>
+                <w:i w:val="0"/>
+                <w:sz w:val="18"/>
+              </w:rPr>
+              <w:t>0.817</w:t>
+            </w:r>
+          </w:p>
+        </w:tc>
+        <w:tc>
+          <w:tcPr>
+            <w:tcW w:type="dxa" w:w="1814"/>
+          </w:tcPr>
+          <w:p>
+            <w:pPr>
+              <w:spacing w:line="240" w:lineRule="auto" w:after="40" w:before="40"/>
+              <w:jc w:val="right"/>
+            </w:pPr>
+            <w:r>
+              <w:rPr>
+                <w:b w:val="0"/>
+                <w:i w:val="0"/>
+                <w:sz w:val="18"/>
+              </w:rPr>
+              <w:t>+0.053 (0.044–0.064)</w:t>
+            </w:r>
+          </w:p>
+        </w:tc>
+      </w:tr>
+      <w:tr>
+        <w:trPr>
+          <w:cantSplit/>
+        </w:trPr>
+        <w:tc>
+          <w:tcPr>
+            <w:tcW w:type="dxa" w:w="1701"/>
+          </w:tcPr>
+          <w:p>
+            <w:pPr>
+              <w:spacing w:line="240" w:lineRule="auto" w:after="40" w:before="40"/>
+              <w:jc w:val="left"/>
+            </w:pPr>
+            <w:r>
+              <w:rPr>
+                <w:b w:val="0"/>
+                <w:i w:val="0"/>
+                <w:sz w:val="18"/>
+              </w:rPr>
+              <w:t>CAP ≥ 302 dB/m</w:t>
+            </w:r>
+          </w:p>
+        </w:tc>
+        <w:tc>
+          <w:tcPr>
+            <w:tcW w:type="dxa" w:w="1134"/>
+          </w:tcPr>
+          <w:p>
+            <w:pPr>
+              <w:spacing w:line="240" w:lineRule="auto" w:after="40" w:before="40"/>
+              <w:jc w:val="right"/>
+            </w:pPr>
+            <w:r>
+              <w:rPr>
+                <w:b w:val="0"/>
+                <w:i w:val="0"/>
+                <w:sz w:val="18"/>
+              </w:rPr>
+              <w:t>0.874</w:t>
+            </w:r>
+          </w:p>
+        </w:tc>
+        <w:tc>
+          <w:tcPr>
+            <w:tcW w:type="dxa" w:w="1020"/>
+          </w:tcPr>
+          <w:p>
+            <w:pPr>
+              <w:spacing w:line="240" w:lineRule="auto" w:after="40" w:before="40"/>
+              <w:jc w:val="right"/>
+            </w:pPr>
+            <w:r>
+              <w:rPr>
+                <w:b w:val="0"/>
+                <w:i w:val="0"/>
+                <w:sz w:val="18"/>
+              </w:rPr>
+              <w:t>0.841</w:t>
+            </w:r>
+          </w:p>
+        </w:tc>
+        <w:tc>
+          <w:tcPr>
+            <w:tcW w:type="dxa" w:w="1814"/>
+          </w:tcPr>
+          <w:p>
+            <w:pPr>
+              <w:spacing w:line="240" w:lineRule="auto" w:after="40" w:before="40"/>
+              <w:jc w:val="right"/>
+            </w:pPr>
+            <w:r>
+              <w:rPr>
+                <w:b w:val="0"/>
+                <w:i w:val="0"/>
+                <w:sz w:val="18"/>
+              </w:rPr>
+              <w:t>+0.033 (0.025–0.042)</w:t>
+            </w:r>
+          </w:p>
+        </w:tc>
+        <w:tc>
+          <w:tcPr>
+            <w:tcW w:type="dxa" w:w="1020"/>
+          </w:tcPr>
+          <w:p>
+            <w:pPr>
+              <w:spacing w:line="240" w:lineRule="auto" w:after="40" w:before="40"/>
+              <w:jc w:val="right"/>
+            </w:pPr>
+            <w:r>
+              <w:rPr>
+                <w:b w:val="0"/>
+                <w:i w:val="0"/>
+                <w:sz w:val="18"/>
+              </w:rPr>
+              <w:t>0.812</w:t>
+            </w:r>
+          </w:p>
+        </w:tc>
+        <w:tc>
+          <w:tcPr>
+            <w:tcW w:type="dxa" w:w="1814"/>
+          </w:tcPr>
+          <w:p>
+            <w:pPr>
+              <w:spacing w:line="240" w:lineRule="auto" w:after="40" w:before="40"/>
+              <w:jc w:val="right"/>
+            </w:pPr>
+            <w:r>
+              <w:rPr>
+                <w:b w:val="0"/>
+                <w:i w:val="0"/>
+                <w:sz w:val="18"/>
+              </w:rPr>
+              <w:t>+0.062 (0.049–0.074)</w:t>
+            </w:r>
+          </w:p>
+        </w:tc>
+      </w:tr>
+    </w:tbl>
+    <w:p>
+      <w:pPr>
+        <w:spacing w:after="40"/>
+      </w:pPr>
+    </w:p>
+    <w:p>
+      <w:r>
+        <w:rPr>
+          <w:b w:val="0"/>
+          <w:i w:val="0"/>
+        </w:rPr>
+        <w:t>The model discriminates better than both scores at every cut-off, and every interval excludes zero. The margin over FLI is modest, which is expected: FLI is itself a strong predictor and a derived FLI value is one of the model inputs. The gain grows with stricter cut-offs. FLI was computed with non-fasting serum triglycerides, because fasting values exist for only part of the cohort, which may slightly disadvantage it.</w:t>
+      </w:r>
+    </w:p>
+    <w:p>
+      <w:pPr>
+        <w:keepNext/>
+        <w:spacing w:before="240"/>
+        <w:jc w:val="center"/>
+      </w:pPr>
+      <w:r>
+        <w:drawing>
+          <wp:inline xmlns:a="http://schemas.openxmlformats.org/drawingml/2006/main" xmlns:pic="http://schemas.openxmlformats.org/drawingml/2006/picture">
+            <wp:extent cx="5724000" cy="2849512"/>
+            <wp:docPr id="1" name="Picture 1"/>
+            <wp:cNvGraphicFramePr>
+              <a:graphicFrameLocks noChangeAspect="1"/>
+            </wp:cNvGraphicFramePr>
+            <a:graphic>
+              <a:graphicData uri="http://schemas.openxmlformats.org/drawingml/2006/picture">
+                <pic:pic>
+                  <pic:nvPicPr>
+                    <pic:cNvPr id="0" name="fig_roc_curves.png"/>
+                    <pic:cNvPicPr/>
+                  </pic:nvPicPr>
+                  <pic:blipFill>
+                    <a:blip r:embed="rId9"/>
+                    <a:stretch>
+                      <a:fillRect/>
+                    </a:stretch>
+                  </pic:blipFill>
+                  <pic:spPr>
+                    <a:xfrm>
+                      <a:off x="0" y="0"/>
+                      <a:ext cx="5724000" cy="2849512"/>
+                    </a:xfrm>
+                    <a:prstGeom prst="rect"/>
+                  </pic:spPr>
+                </pic:pic>
+              </a:graphicData>
+            </a:graphic>
+          </wp:inline>
+        </w:drawing>
+      </w:r>
+    </w:p>
+    <w:p>
+      <w:pPr>
+        <w:pStyle w:val="Caption"/>
+        <w:spacing w:before="80" w:after="240"/>
+      </w:pPr>
+      <w:r>
+        <w:rPr>
+          <w:b/>
+        </w:rPr>
+        <w:t xml:space="preserve">Figure A.1. </w:t>
+      </w:r>
+      <w:r>
+        <w:t>Receiver operating characteristic curves on the held-out test set. (a) The three steatosis classifiers. (b) The CAP ≥ 248 dB/m classifier against the Fatty Liver Index and the Hepatic Steatosis Index on the 2,703 participants with complete inputs.</w:t>
+      </w:r>
+    </w:p>
+    <w:p>
+      <w:pPr>
+        <w:keepNext/>
+        <w:spacing w:before="240"/>
+        <w:jc w:val="center"/>
+      </w:pPr>
+      <w:r>
+        <w:drawing>
+          <wp:inline xmlns:a="http://schemas.openxmlformats.org/drawingml/2006/main" xmlns:pic="http://schemas.openxmlformats.org/drawingml/2006/picture">
+            <wp:extent cx="5724000" cy="3672768"/>
+            <wp:docPr id="2" name="Picture 2"/>
+            <wp:cNvGraphicFramePr>
+              <a:graphicFrameLocks noChangeAspect="1"/>
+            </wp:cNvGraphicFramePr>
+            <a:graphic>
+              <a:graphicData uri="http://schemas.openxmlformats.org/drawingml/2006/picture">
+                <pic:pic>
+                  <pic:nvPicPr>
+                    <pic:cNvPr id="0" name="fig_calibration.png"/>
+                    <pic:cNvPicPr/>
+                  </pic:nvPicPr>
+                  <pic:blipFill>
+                    <a:blip r:embed="rId10"/>
+                    <a:stretch>
+                      <a:fillRect/>
+                    </a:stretch>
+                  </pic:blipFill>
+                  <pic:spPr>
+                    <a:xfrm>
+                      <a:off x="0" y="0"/>
+                      <a:ext cx="5724000" cy="3672768"/>
+                    </a:xfrm>
+                    <a:prstGeom prst="rect"/>
+                  </pic:spPr>
+                </pic:pic>
+              </a:graphicData>
+            </a:graphic>
+          </wp:inline>
+        </w:drawing>
+      </w:r>
+    </w:p>
+    <w:p>
+      <w:pPr>
+        <w:pStyle w:val="Caption"/>
+        <w:spacing w:before="80" w:after="240"/>
+      </w:pPr>
+      <w:r>
+        <w:rPr>
+          <w:b/>
+        </w:rPr>
+        <w:t xml:space="preserve">Figure A.2. </w:t>
+      </w:r>
+      <w:r>
+        <w:t>Calibration of the isotonic-calibrated classifiers on the held-out test set (n = 3,060). Points are deciles of predicted probability with 95% binomial intervals; the histograms show the distribution of predicted probabilities.</w:t>
+      </w:r>
+    </w:p>
+    <w:p>
+      <w:r>
+        <w:rPr>
+          <w:b w:val="0"/>
+          <w:i w:val="0"/>
+        </w:rPr>
+        <w:t>The SHAP summary (Figure A.3) shows that the classifier relies mainly on central adiposity (waist circumference and waist ratios), followed by body weight, age, HbA1c, creatinine and the triglyceride-glucose index. SHAP values were computed with XGBoost’s exact TreeSHAP on the uncalibrated model; isotonic calibration is monotone, so the ranking of features is unchanged. SHAP describes how the model uses its inputs and does not establish causal effects.</w:t>
+      </w:r>
+    </w:p>
+    <w:p>
+      <w:pPr>
+        <w:keepNext/>
+        <w:spacing w:before="240"/>
+        <w:jc w:val="center"/>
+      </w:pPr>
+      <w:r>
+        <w:drawing>
+          <wp:inline xmlns:a="http://schemas.openxmlformats.org/drawingml/2006/main" xmlns:pic="http://schemas.openxmlformats.org/drawingml/2006/picture">
+            <wp:extent cx="5724000" cy="3465676"/>
+            <wp:docPr id="3" name="Picture 3"/>
+            <wp:cNvGraphicFramePr>
+              <a:graphicFrameLocks noChangeAspect="1"/>
+            </wp:cNvGraphicFramePr>
+            <a:graphic>
+              <a:graphicData uri="http://schemas.openxmlformats.org/drawingml/2006/picture">
+                <pic:pic>
+                  <pic:nvPicPr>
+                    <pic:cNvPr id="0" name="fig_shap_cap248.png"/>
+                    <pic:cNvPicPr/>
+                  </pic:nvPicPr>
+                  <pic:blipFill>
+                    <a:blip r:embed="rId11"/>
+                    <a:stretch>
+                      <a:fillRect/>
+                    </a:stretch>
+                  </pic:blipFill>
+                  <pic:spPr>
+                    <a:xfrm>
+                      <a:off x="0" y="0"/>
+                      <a:ext cx="5724000" cy="3465676"/>
+                    </a:xfrm>
+                    <a:prstGeom prst="rect"/>
+                  </pic:spPr>
+                </pic:pic>
+              </a:graphicData>
+            </a:graphic>
+          </wp:inline>
+        </w:drawing>
+      </w:r>
+    </w:p>
+    <w:p>
+      <w:pPr>
+        <w:pStyle w:val="Caption"/>
+        <w:spacing w:before="80" w:after="240"/>
+      </w:pPr>
+      <w:r>
+        <w:rPr>
+          <w:b/>
+        </w:rPr>
+        <w:t xml:space="preserve">Figure A.3. </w:t>
+      </w:r>
+      <w:r>
+        <w:t>SHAP summary for the CAP ≥ 248 dB/m classifier on the held-out test set. Each point is one participant; colour shows the input value and position its effect on the log-odds of steatosis.</w:t>
+      </w:r>
+    </w:p>
+    <w:p>
+      <w:r>
+        <w:rPr>
+          <w:b w:val="0"/>
+          <w:i w:val="0"/>
+        </w:rPr>
+        <w:t>The learning curve (Figure A.4) refits the selected settings on random subsets of the training set. Test R² rises from 0.441 with 1,224 participants to 0.493 with 9,180 and does not improve with the full 12,240; AUC follows the same pattern (0.839 to 0.856). This confirms that the plateau described in Section A.9 is not caused by a shortage of participants.</w:t>
+      </w:r>
+    </w:p>
+    <w:p>
+      <w:pPr>
+        <w:keepNext/>
+        <w:spacing w:before="240"/>
+        <w:jc w:val="center"/>
+      </w:pPr>
+      <w:r>
+        <w:drawing>
+          <wp:inline xmlns:a="http://schemas.openxmlformats.org/drawingml/2006/main" xmlns:pic="http://schemas.openxmlformats.org/drawingml/2006/picture">
+            <wp:extent cx="5724000" cy="2513965"/>
+            <wp:docPr id="4" name="Picture 4"/>
+            <wp:cNvGraphicFramePr>
+              <a:graphicFrameLocks noChangeAspect="1"/>
+            </wp:cNvGraphicFramePr>
+            <a:graphic>
+              <a:graphicData uri="http://schemas.openxmlformats.org/drawingml/2006/picture">
+                <pic:pic>
+                  <pic:nvPicPr>
+                    <pic:cNvPr id="0" name="fig_learning_curve.png"/>
+                    <pic:cNvPicPr/>
+                  </pic:nvPicPr>
+                  <pic:blipFill>
+                    <a:blip r:embed="rId12"/>
+                    <a:stretch>
+                      <a:fillRect/>
+                    </a:stretch>
+                  </pic:blipFill>
+                  <pic:spPr>
+                    <a:xfrm>
+                      <a:off x="0" y="0"/>
+                      <a:ext cx="5724000" cy="2513965"/>
+                    </a:xfrm>
+                    <a:prstGeom prst="rect"/>
+                  </pic:spPr>
+                </pic:pic>
+              </a:graphicData>
+            </a:graphic>
+          </wp:inline>
+        </w:drawing>
+      </w:r>
+    </w:p>
+    <w:p>
+      <w:pPr>
+        <w:pStyle w:val="Caption"/>
+        <w:spacing w:before="80" w:after="240"/>
+      </w:pPr>
+      <w:r>
+        <w:rPr>
+          <w:b/>
+        </w:rPr>
+        <w:t xml:space="preserve">Figure A.4. </w:t>
+      </w:r>
+      <w:r>
+        <w:t>Learning curves for the selected settings: held-out test performance against the number of training participants.</w:t>
+      </w:r>
+    </w:p>
+    <w:p>
+      <w:pPr>
+        <w:pStyle w:val="Heading2"/>
+      </w:pPr>
+      <w:r>
+        <w:t>A.12 Limitations</w:t>
       </w:r>
     </w:p>
     <w:p>
@@ -10462,7 +11333,7 @@
       </w:r>
     </w:p>
     <w:sectPr>
-      <w:footerReference w:type="default" r:id="rId9"/>
+      <w:footerReference w:type="default" r:id="rId13"/>
       <w:pgSz w:w="11906" w:h="16838"/>
       <w:pgMar w:top="1440" w:right="1440" w:bottom="1440" w:left="1440" w:header="720" w:footer="720" w:gutter="0"/>
       <w:cols w:space="720"/>

</xml_diff>

<commit_message>
Add thesis Introduction and Literature Review chapters and correct published R² figures in the reports
</commit_message>
<xml_diff>
--- a/docs/thesis/HepatoTwin_Experiment_Record.docx
+++ b/docs/thesis/HepatoTwin_Experiment_Record.docx
@@ -8951,7 +8951,7 @@
           <w:b w:val="0"/>
           <w:i w:val="0"/>
         </w:rPr>
-        <w:t>Zhu et al. (2026) reported an AUC of 0.892 for CAP ≥ 248 dB/m in NHANES non-Hispanic Asian participants with BMI &lt; 28 kg/m², using a model developed in non-obese Chinese adults. On the same subgroup of the held-out test set (n = 209) the selected classifier reached 0.799, and 0.783 for all adults with BMI &lt; 28 (n = 1,151). The cause was examined on the training partition by comparing the model with the Fatty Liver Index within BMI bands, and four lean-specific classifiers were tried.</w:t>
+        <w:t>Zhu et al. (2026) developed a three-grade steatosis model in non-obese Chinese adults and reported a macro-average AUC of 0.874 in 726 NHANES non-Hispanic Asian participants with BMI &lt; 28 kg/m². Their metric averages the AUCs of three grades, so it is not directly comparable with a single CAP ≥ 248 dB/m threshold. On the same subgroup of the held-out test set (n = 209) the selected classifier reached 0.799, and 0.783 for all adults with BMI &lt; 28 (n = 1,151). The cause was examined on the training partition by comparing the model with the Fatty Liver Index within BMI bands, and four lean-specific classifiers were tried.</w:t>
       </w:r>
     </w:p>
     <w:p>
@@ -17945,7 +17945,7 @@
                 <w:i w:val="0"/>
                 <w:sz w:val="17"/>
               </w:rPr>
-              <w:t>0.63–0.65</w:t>
+              <w:t>0.63–0.64</w:t>
             </w:r>
           </w:p>
         </w:tc>
@@ -18045,7 +18045,7 @@
                 <w:i w:val="0"/>
                 <w:sz w:val="17"/>
               </w:rPr>
-              <w:t>0.28–0.35</w:t>
+              <w:t>0.28–0.36</w:t>
             </w:r>
           </w:p>
         </w:tc>
@@ -18145,7 +18145,7 @@
                 <w:i w:val="0"/>
                 <w:sz w:val="17"/>
               </w:rPr>
-              <w:t>0.56 (one fold)</w:t>
+              <w:t>0.54 (four-fold mean)</w:t>
             </w:r>
           </w:p>
         </w:tc>
@@ -18626,7 +18626,7 @@
                 <w:i w:val="0"/>
                 <w:sz w:val="17"/>
               </w:rPr>
-              <w:t>Clinical factors such as BMI</w:t>
+              <w:t>BMI and 24 clinical factors</w:t>
             </w:r>
           </w:p>
         </w:tc>
@@ -18645,7 +18645,7 @@
                 <w:i w:val="0"/>
                 <w:sz w:val="17"/>
               </w:rPr>
-              <w:t>Not reliable¶</w:t>
+              <w:t>r 0.58 (R² ≈ 0.34)¶</w:t>
             </w:r>
           </w:p>
         </w:tc>
@@ -18862,7 +18862,7 @@
           <w:i/>
           <w:sz w:val="18"/>
         </w:rPr>
-        <w:t>*Model scope (ages 12–59, reliable reference); all ages and examinations: 0.50. †Includes a specialist marker (phosphorylated IGFBP-1). ‡Discovery / validation for Petäjä et al.; validation for Liu et al. (0.70–0.76 in the derivation sample). The Chinese CAP study is small and selected (median CAP 320–335 dB/m against 251 in NHANES), which widens the outcome range and raises R². §Spearman correlation between predicted and measured liver fat, without a validation cohort. ¶Kotronen et al. report AUC 0.86–0.87 but no R² for their liver fat equation; Haas et al. state that liver fat could not be reliably estimated from clinical factors such as BMI.</w:t>
+        <w:t>*Model scope (ages 12–59, reliable reference); all ages and examinations: 0.50. †Includes a specialist marker (phosphorylated IGFBP-1). ‡Discovery / validation for Petäjä et al.; validation for Liu et al. (0.70–0.76 in the derivation sample). The Chinese CAP study is small and selected (median CAP 320–335 dB/m against 251 in NHANES), which widens the outcome range and raises R². §Spearman correlation between predicted and measured liver fat, without a validation cohort. ¶Kotronen et al. report AUC 0.86–0.87 but no R² for their liver fat equation; Haas et al. report correlations rather than R² (r 0.42 for BMI alone and 0.58 with 24 clinical factors, R² ≈ 0.34) and conclude that liver fat cannot be reliably estimated from clinical factors.</w:t>
       </w:r>
     </w:p>
     <w:p>
@@ -19793,7 +19793,7 @@
                 <w:i w:val="0"/>
                 <w:sz w:val="17"/>
               </w:rPr>
-              <w:t>AUC 0.892</w:t>
+              <w:t>Macro AUC 0.874 (three grades)</w:t>
             </w:r>
           </w:p>
         </w:tc>
@@ -19838,7 +19838,7 @@
           <w:b w:val="0"/>
           <w:i w:val="0"/>
         </w:rPr>
-        <w:t>Within its scope, the selected model’s held-out R² (0.56; 0.59 in cross-validation) is comparable to or above published routine-data models of liver fat (0.34–0.56, including 0.37 in UK Biobank and 0.49 in validation for a spectroscopy equation that needs a specialist marker). Across all ages its R² of 0.50 still exceeds the UK Biobank routine-data model. The studies differ in reference measure and population, so the values are indicative rather than directly comparable. Higher values come only from a small selected sample (0.65) or imaging inputs (0.63–0.65). No NHANES study reports R² for CAP, so this is the first such benchmark. In classification the selected model matches or exceeds every NHANES model, except Zhu et al. (2026) in lean Asian participants (Section A.8).</w:t>
+        <w:t>Within its scope, the selected model’s held-out R² (0.56; 0.59 in cross-validation) is comparable to or above published routine-data models of liver fat (0.34–0.54, including 0.37 in UK Biobank and 0.49 in validation for a spectroscopy equation that needs a specialist marker). Across all ages its R² of 0.50 still exceeds the UK Biobank routine-data model. The studies differ in reference measure and population, so the values are indicative rather than directly comparable. Higher values come only from a small selected sample (0.65) or imaging inputs (0.63–0.64). No NHANES study reports R² for CAP, so this is the first such benchmark. In classification the selected model matches or exceeds every NHANES model; the exception is lean Asian participants, where its AUC (0.80) is below the three-grade macro AUC of Zhu et al. (2026, 0.874), although the two metrics are not directly comparable (Section A.8).</w:t>
       </w:r>
     </w:p>
     <w:p>
@@ -20154,7 +20154,7 @@
           <w:b w:val="0"/>
           <w:i w:val="0"/>
         </w:rPr>
-        <w:t>• In lean non-Hispanic Asian participants the model is less discriminating than one trained on a large Asian cohort (Zhu et al., 2026); a population-specific model is future work.</w:t>
+        <w:t>• In lean non-Hispanic Asian participants the model’s AUC (0.80) is below the three-grade macro AUC reported for a model trained on a large Asian cohort (0.874; Zhu et al., 2026), although the metrics differ; a population-specific model is future work.</w:t>
       </w:r>
     </w:p>
     <w:sectPr>

</xml_diff>